<commit_message>
docs: refresh manuals for notebook workflow
</commit_message>
<xml_diff>
--- a/apps/web/public/manual/daon-getting-started.docx
+++ b/apps/web/public/manual/daon-getting-started.docx
@@ -42,7 +42,7 @@
           <w:color w:val="5A5A64"/>
           <w:sz w:val="24"/>
         </w:rPr>
-        <w:t>Notebook의 첫 작업 흐름과 현재 준비 상태</w:t>
+        <w:t>Notebook의 첫 작업 흐름과 안전한 운영</w:t>
       </w:r>
     </w:p>
     <w:p>
@@ -57,7 +57,7 @@
           <w:color w:val="2E74B5"/>
           <w:sz w:val="20"/>
         </w:rPr>
-        <w:t>Release 1.0.0 · 2026-08-16 · 한국어</w:t>
+        <w:t>Release 1.0.0 · 2026-08-20 · 한국어</w:t>
       </w:r>
     </w:p>
     <w:p>
@@ -492,6 +492,19 @@
         </w:numPr>
       </w:pPr>
       <w:r>
+        <w:t>업데이트: 2026-08-20</w:t>
+      </w:r>
+    </w:p>
+    <w:p>
+      <w:pPr>
+        <w:spacing w:after="80" w:line="300" w:lineRule="auto"/>
+        <w:ind w:left="540" w:hanging="271"/>
+        <w:numPr>
+          <w:ilvl w:val="0"/>
+          <w:numId w:val="10"/>
+        </w:numPr>
+      </w:pPr>
+      <w:r>
         <w:t>언어: 한국어(ko-KR)</w:t>
       </w:r>
     </w:p>
@@ -533,7 +546,7 @@
           <w:color w:val="1F4D78"/>
           <w:sz w:val="20"/>
         </w:rPr>
-        <w:t>현재 Release의 첫 성공 경로 중 Notebook 생성과 Notebook 홈은 Phase D 준비 중입니다. 로그인 연결은 Phase E에서 마지막에 결합합니다. 지금 검증된 범위는 선택된 Test Notebook의 3열 화면에서 Source를 추가하고, 질문과 Citation을 확인하고, 지원되는 Studio 산출물을 생성·저장하는 흐름입니다.</w:t>
+        <w:t>현재 Release는 로그인 → Notebook 홈 → 새 Notebook 또는 기존 Notebook 선택 → 3열 작업 화면을 연결합니다. Source·질문·Studio는 선택한 Notebook 범위에서만 동작하며, 외부 LLM 호출은 조직의 외부전송 정책이 허용한 Provider에만 전송됩니다.</w:t>
       </w:r>
     </w:p>
     <w:p>
@@ -630,7 +643,7 @@
         </w:numPr>
       </w:pPr>
       <w:r>
-        <w:t>현재 Release에서는 Notebook 홈과 새 Notebook 만들기가 준비 중입니다.</w:t>
+        <w:t>로그인하면 Notebook 홈이 열립니다.</w:t>
       </w:r>
     </w:p>
     <w:p>
@@ -643,7 +656,7 @@
         </w:numPr>
       </w:pPr>
       <w:r>
-        <w:t>제품에서 임의 Notebook이 자동 생성되거나 선택되지 않습니다.</w:t>
+        <w:t>새 Notebook을 눌러 제목과 선택 설명을 입력하거나 기존 Notebook 카드를 선택합니다.</w:t>
       </w:r>
     </w:p>
     <w:p>
@@ -656,15 +669,20 @@
         </w:numPr>
       </w:pPr>
       <w:r>
-        <w:t>개발·검증에서는 명시된 Test Notebook Context의 3열 화면만 사용합니다.</w:t>
+        <w:t>제품은 임의 Notebook을 자동 선택하지 않습니다. 사용자가 명시적으로 선택한 Notebook만 3열 작업 화면으로 엽니다.</w:t>
       </w:r>
     </w:p>
     <w:p>
       <w:pPr>
-        <w:widowControl/>
+        <w:spacing w:after="80" w:line="300" w:lineRule="auto"/>
+        <w:ind w:left="540" w:hanging="271"/>
+        <w:numPr>
+          <w:ilvl w:val="0"/>
+          <w:numId w:val="11"/>
+        </w:numPr>
       </w:pPr>
       <w:r>
-        <w:t>예상 클릭 위치: 향후 Notebook 홈 오른쪽 위 새 Notebook 만들기. 현재 화면에는 이 Action이 없어야 정상입니다.</w:t>
+        <w:t>검색·최근 수정/제목 정렬·Grid/List 보기로 Notebook을 찾을 수 있습니다.</w:t>
       </w:r>
     </w:p>
     <w:p>
@@ -738,54 +756,6 @@
       </w:r>
     </w:p>
     <w:p>
-      <w:pPr>
-        <w:jc w:val="center"/>
-      </w:pPr>
-      <w:r>
-        <w:drawing>
-          <wp:inline xmlns:a="http://schemas.openxmlformats.org/drawingml/2006/main" xmlns:pic="http://schemas.openxmlformats.org/drawingml/2006/picture">
-            <wp:extent cx="5806440" cy="3266122"/>
-            <wp:docPr id="1" name="Picture 1" descr="현재 Source·대화·Studio 3열 화면"/>
-            <wp:cNvGraphicFramePr>
-              <a:graphicFrameLocks noChangeAspect="1"/>
-            </wp:cNvGraphicFramePr>
-            <a:graphic>
-              <a:graphicData uri="http://schemas.openxmlformats.org/drawingml/2006/picture">
-                <pic:pic>
-                  <pic:nvPicPr>
-                    <pic:cNvPr id="0" name="01-workspace-default-1920x1080.png"/>
-                    <pic:cNvPicPr/>
-                  </pic:nvPicPr>
-                  <pic:blipFill>
-                    <a:blip r:embed="rId11"/>
-                    <a:stretch>
-                      <a:fillRect/>
-                    </a:stretch>
-                  </pic:blipFill>
-                  <pic:spPr>
-                    <a:xfrm>
-                      <a:off x="0" y="0"/>
-                      <a:ext cx="5806440" cy="3266122"/>
-                    </a:xfrm>
-                    <a:prstGeom prst="rect"/>
-                  </pic:spPr>
-                </pic:pic>
-              </a:graphicData>
-            </a:graphic>
-          </wp:inline>
-        </w:drawing>
-      </w:r>
-    </w:p>
-    <w:p>
-      <w:pPr>
-        <w:pStyle w:val="DaonCaption"/>
-        <w:jc w:val="center"/>
-      </w:pPr>
-      <w:r>
-        <w:t>현재 Source·대화·Studio 3열 화면</w:t>
-      </w:r>
-    </w:p>
-    <w:p>
       <w:bookmarkStart w:id="8" w:name="toc_8"/>
       <w:pPr>
         <w:pStyle w:val="Heading2"/>
@@ -852,7 +822,7 @@
         <w:widowControl/>
       </w:pPr>
       <w:r>
-        <w:t>입력 조건: 선택 Context와 질문이 모두 필요합니다. LLM은 연결된 Provider의 사용 가능한 Model 중 사용자가 선택한 Model을 사용하며 자동으로 다른 Provider로 바꾸지 않습니다.</w:t>
+        <w:t>입력 조건: 근거 질문은 선택 Context가 필요합니다. 안녕하세요! 같은 좁은 일반 대화는 Source 없이 실행할 수 있으며 일반 대화 · 근거 미사용으로 표시됩니다. LLM은 연결된 Provider의 사용 가능한 Model 중 사용자가 선택한 Model을 사용하며 자동으로 다른 Provider로 바꾸지 않습니다.</w:t>
       </w:r>
     </w:p>
     <w:p>
@@ -994,54 +964,6 @@
     </w:p>
     <w:p>
       <w:pPr>
-        <w:jc w:val="center"/>
-      </w:pPr>
-      <w:r>
-        <w:drawing>
-          <wp:inline xmlns:a="http://schemas.openxmlformats.org/drawingml/2006/main" xmlns:pic="http://schemas.openxmlformats.org/drawingml/2006/picture">
-            <wp:extent cx="5806440" cy="3266122"/>
-            <wp:docPr id="2" name="Picture 2" descr="보고서 생성 설정 화면"/>
-            <wp:cNvGraphicFramePr>
-              <a:graphicFrameLocks noChangeAspect="1"/>
-            </wp:cNvGraphicFramePr>
-            <a:graphic>
-              <a:graphicData uri="http://schemas.openxmlformats.org/drawingml/2006/picture">
-                <pic:pic>
-                  <pic:nvPicPr>
-                    <pic:cNvPr id="0" name="02-report-settings-1920x1080.png"/>
-                    <pic:cNvPicPr/>
-                  </pic:nvPicPr>
-                  <pic:blipFill>
-                    <a:blip r:embed="rId12"/>
-                    <a:stretch>
-                      <a:fillRect/>
-                    </a:stretch>
-                  </pic:blipFill>
-                  <pic:spPr>
-                    <a:xfrm>
-                      <a:off x="0" y="0"/>
-                      <a:ext cx="5806440" cy="3266122"/>
-                    </a:xfrm>
-                    <a:prstGeom prst="rect"/>
-                  </pic:spPr>
-                </pic:pic>
-              </a:graphicData>
-            </a:graphic>
-          </wp:inline>
-        </w:drawing>
-      </w:r>
-    </w:p>
-    <w:p>
-      <w:pPr>
-        <w:pStyle w:val="DaonCaption"/>
-        <w:jc w:val="center"/>
-      </w:pPr>
-      <w:r>
-        <w:t>보고서 생성 설정 화면</w:t>
-      </w:r>
-    </w:p>
-    <w:p>
-      <w:pPr>
         <w:widowControl/>
       </w:pPr>
       <w:r>
@@ -1120,7 +1042,7 @@
         </w:numPr>
       </w:pPr>
       <w:r>
-        <w:t>Notebook 홈이 완성되기 전에는 새 Notebook 생성 성공 화면이 나타나지 않습니다.</w:t>
+        <w:t>Notebook 홈에서 생성한 Notebook은 즉시 빈 3열 작업 화면으로 열리고, 기존 Notebook은 저장된 선택 Context를 다시 검증한 뒤 엽니다.</w:t>
       </w:r>
     </w:p>
     <w:p>
@@ -1183,6 +1105,19 @@
       </w:pPr>
       <w:r>
         <w:t>TEXT_MODEL_NOT_SELECTED: 설정의 LLM 설정에서 사용 가능한 Model을 선택합니다.</w:t>
+      </w:r>
+    </w:p>
+    <w:p>
+      <w:pPr>
+        <w:spacing w:after="80" w:line="300" w:lineRule="auto"/>
+        <w:ind w:left="540" w:hanging="271"/>
+        <w:numPr>
+          <w:ilvl w:val="0"/>
+          <w:numId w:val="17"/>
+        </w:numPr>
+      </w:pPr>
+      <w:r>
+        <w:t>EGRESS_POLICY_DENIED: 조직 관리자가 허용 Provider·목적지·분류·마스킹 조건을 검토합니다. 사용자는 우회 주소나 다른 Provider로 자동 전환하지 않습니다.</w:t>
       </w:r>
     </w:p>
     <w:p>

</xml_diff>